<commit_message>
Document M3DocVQA doc fusion probe result
</commit_message>
<xml_diff>
--- a/notes/m3docvqa_gpp_ablation_tables_and_meanings.docx
+++ b/notes/m3docvqa_gpp_ablation_tables_and_meanings.docx
@@ -13800,6 +13800,844 @@
           <w:sz w:val="21"/>
         </w:rPr>
         <w:t>External hyperlink GPP is blocked until each dataset has URL-to-internal-doc mapping.</w:t>
+      </w:r>
+    </w:p>
+    <w:p>
+      <w:pPr>
+        <w:pStyle w:val="Heading1"/>
+      </w:pPr>
+      <w:r>
+        <w:rPr>
+          <w:rFonts w:ascii="Calibri" w:hAnsi="Calibri"/>
+          <w:color w:val="2E74B5"/>
+        </w:rPr>
+        <w:t>Dev-Split Doc Fusion Probe</w:t>
+      </w:r>
+    </w:p>
+    <w:p>
+      <w:pPr>
+        <w:spacing w:after="120"/>
+      </w:pPr>
+      <w:r>
+        <w:rPr>
+          <w:rFonts w:ascii="Calibri" w:hAnsi="Calibri"/>
+          <w:sz w:val="21"/>
+        </w:rPr>
+        <w:t>New result added May 29, 2026. This is the strongest green-light result for document-level tuning so far: tuned fusion beats the best single eval source.</w:t>
+      </w:r>
+    </w:p>
+    <w:tbl>
+      <w:tblPr>
+        <w:tblW w:type="auto" w:w="0"/>
+        <w:tblLayout w:type="fixed"/>
+        <w:tblLook w:firstColumn="1" w:firstRow="1" w:lastColumn="0" w:lastRow="0" w:noHBand="0" w:noVBand="1" w:val="04A0"/>
+        <w:tblBorders>
+          <w:top w:val="single" w:sz="4" w:space="0" w:color="B8C2CC"/>
+          <w:left w:val="single" w:sz="4" w:space="0" w:color="B8C2CC"/>
+          <w:bottom w:val="single" w:sz="4" w:space="0" w:color="B8C2CC"/>
+          <w:right w:val="single" w:sz="4" w:space="0" w:color="B8C2CC"/>
+          <w:insideH w:val="single" w:sz="4" w:space="0" w:color="B8C2CC"/>
+          <w:insideV w:val="single" w:sz="4" w:space="0" w:color="B8C2CC"/>
+        </w:tblBorders>
+      </w:tblPr>
+      <w:tblGrid>
+        <w:gridCol w:w="2772"/>
+        <w:gridCol w:w="2772"/>
+        <w:gridCol w:w="2772"/>
+        <w:gridCol w:w="2772"/>
+      </w:tblGrid>
+      <w:tr>
+        <w:tc>
+          <w:tcPr>
+            <w:tcW w:type="dxa" w:w="2880"/>
+            <w:vAlign w:val="center"/>
+            <w:tcMar>
+              <w:top w:w="80" w:type="dxa"/>
+              <w:start w:w="120" w:type="dxa"/>
+              <w:bottom w:w="80" w:type="dxa"/>
+              <w:end w:w="120" w:type="dxa"/>
+            </w:tcMar>
+            <w:shd w:fill="E8EEF5"/>
+          </w:tcPr>
+          <w:p>
+            <w:pPr>
+              <w:spacing w:after="0" w:line="252" w:lineRule="auto"/>
+            </w:pPr>
+            <w:r>
+              <w:rPr>
+                <w:rFonts w:ascii="Calibri" w:hAnsi="Calibri"/>
+                <w:b/>
+                <w:color w:val="1F4D78"/>
+                <w:sz w:val="17"/>
+              </w:rPr>
+              <w:t>Method</w:t>
+            </w:r>
+          </w:p>
+        </w:tc>
+        <w:tc>
+          <w:tcPr>
+            <w:tcW w:type="dxa" w:w="1440"/>
+            <w:vAlign w:val="center"/>
+            <w:tcMar>
+              <w:top w:w="80" w:type="dxa"/>
+              <w:start w:w="120" w:type="dxa"/>
+              <w:bottom w:w="80" w:type="dxa"/>
+              <w:end w:w="120" w:type="dxa"/>
+            </w:tcMar>
+            <w:shd w:fill="E8EEF5"/>
+          </w:tcPr>
+          <w:p>
+            <w:pPr>
+              <w:spacing w:after="0" w:line="252" w:lineRule="auto"/>
+            </w:pPr>
+            <w:r>
+              <w:rPr>
+                <w:rFonts w:ascii="Calibri" w:hAnsi="Calibri"/>
+                <w:b/>
+                <w:color w:val="1F4D78"/>
+                <w:sz w:val="17"/>
+              </w:rPr>
+              <w:t>eval doc@4</w:t>
+            </w:r>
+          </w:p>
+        </w:tc>
+        <w:tc>
+          <w:tcPr>
+            <w:tcW w:type="dxa" w:w="1872"/>
+            <w:vAlign w:val="center"/>
+            <w:tcMar>
+              <w:top w:w="80" w:type="dxa"/>
+              <w:start w:w="120" w:type="dxa"/>
+              <w:bottom w:w="80" w:type="dxa"/>
+              <w:end w:w="120" w:type="dxa"/>
+            </w:tcMar>
+            <w:shd w:fill="E8EEF5"/>
+          </w:tcPr>
+          <w:p>
+            <w:pPr>
+              <w:spacing w:after="0" w:line="252" w:lineRule="auto"/>
+            </w:pPr>
+            <w:r>
+              <w:rPr>
+                <w:rFonts w:ascii="Calibri" w:hAnsi="Calibri"/>
+                <w:b/>
+                <w:color w:val="1F4D78"/>
+                <w:sz w:val="17"/>
+              </w:rPr>
+              <w:t>Delta vs best source</w:t>
+            </w:r>
+          </w:p>
+        </w:tc>
+        <w:tc>
+          <w:tcPr>
+            <w:tcW w:type="dxa" w:w="4896"/>
+            <w:vAlign w:val="center"/>
+            <w:tcMar>
+              <w:top w:w="80" w:type="dxa"/>
+              <w:start w:w="120" w:type="dxa"/>
+              <w:bottom w:w="80" w:type="dxa"/>
+              <w:end w:w="120" w:type="dxa"/>
+            </w:tcMar>
+            <w:shd w:fill="E8EEF5"/>
+          </w:tcPr>
+          <w:p>
+            <w:pPr>
+              <w:spacing w:after="0" w:line="252" w:lineRule="auto"/>
+            </w:pPr>
+            <w:r>
+              <w:rPr>
+                <w:rFonts w:ascii="Calibri" w:hAnsi="Calibri"/>
+                <w:b/>
+                <w:color w:val="1F4D78"/>
+                <w:sz w:val="17"/>
+              </w:rPr>
+              <w:t>Meaning</w:t>
+            </w:r>
+          </w:p>
+        </w:tc>
+      </w:tr>
+      <w:tr>
+        <w:tc>
+          <w:tcPr>
+            <w:tcW w:type="dxa" w:w="2880"/>
+            <w:vAlign w:val="center"/>
+            <w:tcMar>
+              <w:top w:w="80" w:type="dxa"/>
+              <w:start w:w="120" w:type="dxa"/>
+              <w:bottom w:w="80" w:type="dxa"/>
+              <w:end w:w="120" w:type="dxa"/>
+            </w:tcMar>
+          </w:tcPr>
+          <w:p>
+            <w:pPr>
+              <w:spacing w:after="0" w:line="252" w:lineRule="auto"/>
+            </w:pPr>
+            <w:r>
+              <w:rPr>
+                <w:rFonts w:ascii="Calibri" w:hAnsi="Calibri"/>
+                <w:sz w:val="17"/>
+              </w:rPr>
+              <w:t>best single eval source</w:t>
+            </w:r>
+          </w:p>
+        </w:tc>
+        <w:tc>
+          <w:tcPr>
+            <w:tcW w:type="dxa" w:w="1440"/>
+            <w:vAlign w:val="center"/>
+            <w:tcMar>
+              <w:top w:w="80" w:type="dxa"/>
+              <w:start w:w="120" w:type="dxa"/>
+              <w:bottom w:w="80" w:type="dxa"/>
+              <w:end w:w="120" w:type="dxa"/>
+            </w:tcMar>
+          </w:tcPr>
+          <w:p>
+            <w:pPr>
+              <w:spacing w:after="0" w:line="252" w:lineRule="auto"/>
+            </w:pPr>
+            <w:r>
+              <w:rPr>
+                <w:rFonts w:ascii="Calibri" w:hAnsi="Calibri"/>
+                <w:sz w:val="17"/>
+              </w:rPr>
+              <w:t>0.8518</w:t>
+            </w:r>
+          </w:p>
+        </w:tc>
+        <w:tc>
+          <w:tcPr>
+            <w:tcW w:type="dxa" w:w="1872"/>
+            <w:vAlign w:val="center"/>
+            <w:tcMar>
+              <w:top w:w="80" w:type="dxa"/>
+              <w:start w:w="120" w:type="dxa"/>
+              <w:bottom w:w="80" w:type="dxa"/>
+              <w:end w:w="120" w:type="dxa"/>
+            </w:tcMar>
+          </w:tcPr>
+          <w:p>
+            <w:pPr>
+              <w:spacing w:after="0" w:line="252" w:lineRule="auto"/>
+            </w:pPr>
+            <w:r>
+              <w:rPr>
+                <w:rFonts w:ascii="Calibri" w:hAnsi="Calibri"/>
+                <w:sz w:val="17"/>
+              </w:rPr>
+              <w:t>0.0000</w:t>
+            </w:r>
+          </w:p>
+        </w:tc>
+        <w:tc>
+          <w:tcPr>
+            <w:tcW w:type="dxa" w:w="4896"/>
+            <w:vAlign w:val="center"/>
+            <w:tcMar>
+              <w:top w:w="80" w:type="dxa"/>
+              <w:start w:w="120" w:type="dxa"/>
+              <w:bottom w:w="80" w:type="dxa"/>
+              <w:end w:w="120" w:type="dxa"/>
+            </w:tcMar>
+          </w:tcPr>
+          <w:p>
+            <w:pPr>
+              <w:spacing w:after="0" w:line="252" w:lineRule="auto"/>
+            </w:pPr>
+            <w:r>
+              <w:rPr>
+                <w:rFonts w:ascii="Calibri" w:hAnsi="Calibri"/>
+                <w:sz w:val="17"/>
+              </w:rPr>
+              <w:t>Best individual source on the eval split.</w:t>
+            </w:r>
+          </w:p>
+        </w:tc>
+      </w:tr>
+      <w:tr>
+        <w:tc>
+          <w:tcPr>
+            <w:tcW w:type="dxa" w:w="2880"/>
+            <w:vAlign w:val="center"/>
+            <w:tcMar>
+              <w:top w:w="80" w:type="dxa"/>
+              <w:start w:w="120" w:type="dxa"/>
+              <w:bottom w:w="80" w:type="dxa"/>
+              <w:end w:w="120" w:type="dxa"/>
+            </w:tcMar>
+          </w:tcPr>
+          <w:p>
+            <w:pPr>
+              <w:spacing w:after="0" w:line="252" w:lineRule="auto"/>
+            </w:pPr>
+            <w:r>
+              <w:rPr>
+                <w:rFonts w:ascii="Calibri" w:hAnsi="Calibri"/>
+                <w:sz w:val="17"/>
+              </w:rPr>
+              <w:t>tuned doc fusion</w:t>
+            </w:r>
+          </w:p>
+        </w:tc>
+        <w:tc>
+          <w:tcPr>
+            <w:tcW w:type="dxa" w:w="1440"/>
+            <w:vAlign w:val="center"/>
+            <w:tcMar>
+              <w:top w:w="80" w:type="dxa"/>
+              <w:start w:w="120" w:type="dxa"/>
+              <w:bottom w:w="80" w:type="dxa"/>
+              <w:end w:w="120" w:type="dxa"/>
+            </w:tcMar>
+          </w:tcPr>
+          <w:p>
+            <w:pPr>
+              <w:spacing w:after="0" w:line="252" w:lineRule="auto"/>
+            </w:pPr>
+            <w:r>
+              <w:rPr>
+                <w:rFonts w:ascii="Calibri" w:hAnsi="Calibri"/>
+                <w:sz w:val="17"/>
+              </w:rPr>
+              <w:t>0.8613</w:t>
+            </w:r>
+          </w:p>
+        </w:tc>
+        <w:tc>
+          <w:tcPr>
+            <w:tcW w:type="dxa" w:w="1872"/>
+            <w:vAlign w:val="center"/>
+            <w:tcMar>
+              <w:top w:w="80" w:type="dxa"/>
+              <w:start w:w="120" w:type="dxa"/>
+              <w:bottom w:w="80" w:type="dxa"/>
+              <w:end w:w="120" w:type="dxa"/>
+            </w:tcMar>
+          </w:tcPr>
+          <w:p>
+            <w:pPr>
+              <w:spacing w:after="0" w:line="252" w:lineRule="auto"/>
+            </w:pPr>
+            <w:r>
+              <w:rPr>
+                <w:rFonts w:ascii="Calibri" w:hAnsi="Calibri"/>
+                <w:sz w:val="17"/>
+              </w:rPr>
+              <w:t>+0.0094</w:t>
+            </w:r>
+          </w:p>
+        </w:tc>
+        <w:tc>
+          <w:tcPr>
+            <w:tcW w:type="dxa" w:w="4896"/>
+            <w:vAlign w:val="center"/>
+            <w:tcMar>
+              <w:top w:w="80" w:type="dxa"/>
+              <w:start w:w="120" w:type="dxa"/>
+              <w:bottom w:w="80" w:type="dxa"/>
+              <w:end w:w="120" w:type="dxa"/>
+            </w:tcMar>
+          </w:tcPr>
+          <w:p>
+            <w:pPr>
+              <w:spacing w:after="0" w:line="252" w:lineRule="auto"/>
+            </w:pPr>
+            <w:r>
+              <w:rPr>
+                <w:rFonts w:ascii="Calibri" w:hAnsi="Calibri"/>
+                <w:sz w:val="17"/>
+              </w:rPr>
+              <w:t>Positive document-level tuning signal.</w:t>
+            </w:r>
+          </w:p>
+        </w:tc>
+      </w:tr>
+    </w:tbl>
+    <w:p/>
+    <w:tbl>
+      <w:tblPr>
+        <w:tblW w:type="auto" w:w="0"/>
+        <w:tblLayout w:type="fixed"/>
+        <w:tblLook w:firstColumn="1" w:firstRow="1" w:lastColumn="0" w:lastRow="0" w:noHBand="0" w:noVBand="1" w:val="04A0"/>
+        <w:tblBorders>
+          <w:top w:val="single" w:sz="4" w:space="0" w:color="B8C2CC"/>
+          <w:left w:val="single" w:sz="4" w:space="0" w:color="B8C2CC"/>
+          <w:bottom w:val="single" w:sz="4" w:space="0" w:color="B8C2CC"/>
+          <w:right w:val="single" w:sz="4" w:space="0" w:color="B8C2CC"/>
+          <w:insideH w:val="single" w:sz="4" w:space="0" w:color="B8C2CC"/>
+          <w:insideV w:val="single" w:sz="4" w:space="0" w:color="B8C2CC"/>
+        </w:tblBorders>
+      </w:tblPr>
+      <w:tblGrid>
+        <w:gridCol w:w="3696"/>
+        <w:gridCol w:w="3696"/>
+        <w:gridCol w:w="3696"/>
+      </w:tblGrid>
+      <w:tr>
+        <w:tc>
+          <w:tcPr>
+            <w:tcW w:type="dxa" w:w="3024"/>
+            <w:vAlign w:val="center"/>
+            <w:tcMar>
+              <w:top w:w="80" w:type="dxa"/>
+              <w:start w:w="120" w:type="dxa"/>
+              <w:bottom w:w="80" w:type="dxa"/>
+              <w:end w:w="120" w:type="dxa"/>
+            </w:tcMar>
+            <w:shd w:fill="E8EEF5"/>
+          </w:tcPr>
+          <w:p>
+            <w:pPr>
+              <w:spacing w:after="0" w:line="252" w:lineRule="auto"/>
+            </w:pPr>
+            <w:r>
+              <w:rPr>
+                <w:rFonts w:ascii="Calibri" w:hAnsi="Calibri"/>
+                <w:b/>
+                <w:color w:val="1F4D78"/>
+                <w:sz w:val="17"/>
+              </w:rPr>
+              <w:t>Source</w:t>
+            </w:r>
+          </w:p>
+        </w:tc>
+        <w:tc>
+          <w:tcPr>
+            <w:tcW w:type="dxa" w:w="1584"/>
+            <w:vAlign w:val="center"/>
+            <w:tcMar>
+              <w:top w:w="80" w:type="dxa"/>
+              <w:start w:w="120" w:type="dxa"/>
+              <w:bottom w:w="80" w:type="dxa"/>
+              <w:end w:w="120" w:type="dxa"/>
+            </w:tcMar>
+            <w:shd w:fill="E8EEF5"/>
+          </w:tcPr>
+          <w:p>
+            <w:pPr>
+              <w:spacing w:after="0" w:line="252" w:lineRule="auto"/>
+            </w:pPr>
+            <w:r>
+              <w:rPr>
+                <w:rFonts w:ascii="Calibri" w:hAnsi="Calibri"/>
+                <w:b/>
+                <w:color w:val="1F4D78"/>
+                <w:sz w:val="17"/>
+              </w:rPr>
+              <w:t>Best weight</w:t>
+            </w:r>
+          </w:p>
+        </w:tc>
+        <w:tc>
+          <w:tcPr>
+            <w:tcW w:type="dxa" w:w="6480"/>
+            <w:vAlign w:val="center"/>
+            <w:tcMar>
+              <w:top w:w="80" w:type="dxa"/>
+              <w:start w:w="120" w:type="dxa"/>
+              <w:bottom w:w="80" w:type="dxa"/>
+              <w:end w:w="120" w:type="dxa"/>
+            </w:tcMar>
+            <w:shd w:fill="E8EEF5"/>
+          </w:tcPr>
+          <w:p>
+            <w:pPr>
+              <w:spacing w:after="0" w:line="252" w:lineRule="auto"/>
+            </w:pPr>
+            <w:r>
+              <w:rPr>
+                <w:rFonts w:ascii="Calibri" w:hAnsi="Calibri"/>
+                <w:b/>
+                <w:color w:val="1F4D78"/>
+                <w:sz w:val="17"/>
+              </w:rPr>
+              <w:t>Interpretation</w:t>
+            </w:r>
+          </w:p>
+        </w:tc>
+      </w:tr>
+      <w:tr>
+        <w:tc>
+          <w:tcPr>
+            <w:tcW w:type="dxa" w:w="3024"/>
+            <w:vAlign w:val="center"/>
+            <w:tcMar>
+              <w:top w:w="80" w:type="dxa"/>
+              <w:start w:w="120" w:type="dxa"/>
+              <w:bottom w:w="80" w:type="dxa"/>
+              <w:end w:w="120" w:type="dxa"/>
+            </w:tcMar>
+          </w:tcPr>
+          <w:p>
+            <w:pPr>
+              <w:spacing w:after="0" w:line="252" w:lineRule="auto"/>
+            </w:pPr>
+            <w:r>
+              <w:rPr>
+                <w:rFonts w:ascii="Calibri" w:hAnsi="Calibri"/>
+                <w:sz w:val="17"/>
+              </w:rPr>
+              <w:t>dense</w:t>
+            </w:r>
+          </w:p>
+        </w:tc>
+        <w:tc>
+          <w:tcPr>
+            <w:tcW w:type="dxa" w:w="1584"/>
+            <w:vAlign w:val="center"/>
+            <w:tcMar>
+              <w:top w:w="80" w:type="dxa"/>
+              <w:start w:w="120" w:type="dxa"/>
+              <w:bottom w:w="80" w:type="dxa"/>
+              <w:end w:w="120" w:type="dxa"/>
+            </w:tcMar>
+          </w:tcPr>
+          <w:p>
+            <w:pPr>
+              <w:spacing w:after="0" w:line="252" w:lineRule="auto"/>
+            </w:pPr>
+            <w:r>
+              <w:rPr>
+                <w:rFonts w:ascii="Calibri" w:hAnsi="Calibri"/>
+                <w:sz w:val="17"/>
+              </w:rPr>
+              <w:t>2.00</w:t>
+            </w:r>
+          </w:p>
+        </w:tc>
+        <w:tc>
+          <w:tcPr>
+            <w:tcW w:type="dxa" w:w="6480"/>
+            <w:vAlign w:val="center"/>
+            <w:tcMar>
+              <w:top w:w="80" w:type="dxa"/>
+              <w:start w:w="120" w:type="dxa"/>
+              <w:bottom w:w="80" w:type="dxa"/>
+              <w:end w:w="120" w:type="dxa"/>
+            </w:tcMar>
+          </w:tcPr>
+          <w:p>
+            <w:pPr>
+              <w:spacing w:after="0" w:line="252" w:lineRule="auto"/>
+            </w:pPr>
+            <w:r>
+              <w:rPr>
+                <w:rFonts w:ascii="Calibri" w:hAnsi="Calibri"/>
+                <w:sz w:val="17"/>
+              </w:rPr>
+              <w:t>Useful base retrieval signal.</w:t>
+            </w:r>
+          </w:p>
+        </w:tc>
+      </w:tr>
+      <w:tr>
+        <w:tc>
+          <w:tcPr>
+            <w:tcW w:type="dxa" w:w="3024"/>
+            <w:vAlign w:val="center"/>
+            <w:tcMar>
+              <w:top w:w="80" w:type="dxa"/>
+              <w:start w:w="120" w:type="dxa"/>
+              <w:bottom w:w="80" w:type="dxa"/>
+              <w:end w:w="120" w:type="dxa"/>
+            </w:tcMar>
+          </w:tcPr>
+          <w:p>
+            <w:pPr>
+              <w:spacing w:after="0" w:line="252" w:lineRule="auto"/>
+            </w:pPr>
+            <w:r>
+              <w:rPr>
+                <w:rFonts w:ascii="Calibri" w:hAnsi="Calibri"/>
+                <w:sz w:val="17"/>
+              </w:rPr>
+              <w:t>splade</w:t>
+            </w:r>
+          </w:p>
+        </w:tc>
+        <w:tc>
+          <w:tcPr>
+            <w:tcW w:type="dxa" w:w="1584"/>
+            <w:vAlign w:val="center"/>
+            <w:tcMar>
+              <w:top w:w="80" w:type="dxa"/>
+              <w:start w:w="120" w:type="dxa"/>
+              <w:bottom w:w="80" w:type="dxa"/>
+              <w:end w:w="120" w:type="dxa"/>
+            </w:tcMar>
+          </w:tcPr>
+          <w:p>
+            <w:pPr>
+              <w:spacing w:after="0" w:line="252" w:lineRule="auto"/>
+            </w:pPr>
+            <w:r>
+              <w:rPr>
+                <w:rFonts w:ascii="Calibri" w:hAnsi="Calibri"/>
+                <w:sz w:val="17"/>
+              </w:rPr>
+              <w:t>4.00</w:t>
+            </w:r>
+          </w:p>
+        </w:tc>
+        <w:tc>
+          <w:tcPr>
+            <w:tcW w:type="dxa" w:w="6480"/>
+            <w:vAlign w:val="center"/>
+            <w:tcMar>
+              <w:top w:w="80" w:type="dxa"/>
+              <w:start w:w="120" w:type="dxa"/>
+              <w:bottom w:w="80" w:type="dxa"/>
+              <w:end w:w="120" w:type="dxa"/>
+            </w:tcMar>
+          </w:tcPr>
+          <w:p>
+            <w:pPr>
+              <w:spacing w:after="0" w:line="252" w:lineRule="auto"/>
+            </w:pPr>
+            <w:r>
+              <w:rPr>
+                <w:rFonts w:ascii="Calibri" w:hAnsi="Calibri"/>
+                <w:sz w:val="17"/>
+              </w:rPr>
+              <w:t>Strong sparse signal.</w:t>
+            </w:r>
+          </w:p>
+        </w:tc>
+      </w:tr>
+      <w:tr>
+        <w:tc>
+          <w:tcPr>
+            <w:tcW w:type="dxa" w:w="3024"/>
+            <w:vAlign w:val="center"/>
+            <w:tcMar>
+              <w:top w:w="80" w:type="dxa"/>
+              <w:start w:w="120" w:type="dxa"/>
+              <w:bottom w:w="80" w:type="dxa"/>
+              <w:end w:w="120" w:type="dxa"/>
+            </w:tcMar>
+          </w:tcPr>
+          <w:p>
+            <w:pPr>
+              <w:spacing w:after="0" w:line="252" w:lineRule="auto"/>
+            </w:pPr>
+            <w:r>
+              <w:rPr>
+                <w:rFonts w:ascii="Calibri" w:hAnsi="Calibri"/>
+                <w:sz w:val="17"/>
+              </w:rPr>
+              <w:t>gpp_no_hyperlink</w:t>
+            </w:r>
+          </w:p>
+        </w:tc>
+        <w:tc>
+          <w:tcPr>
+            <w:tcW w:type="dxa" w:w="1584"/>
+            <w:vAlign w:val="center"/>
+            <w:tcMar>
+              <w:top w:w="80" w:type="dxa"/>
+              <w:start w:w="120" w:type="dxa"/>
+              <w:bottom w:w="80" w:type="dxa"/>
+              <w:end w:w="120" w:type="dxa"/>
+            </w:tcMar>
+          </w:tcPr>
+          <w:p>
+            <w:pPr>
+              <w:spacing w:after="0" w:line="252" w:lineRule="auto"/>
+            </w:pPr>
+            <w:r>
+              <w:rPr>
+                <w:rFonts w:ascii="Calibri" w:hAnsi="Calibri"/>
+                <w:sz w:val="17"/>
+              </w:rPr>
+              <w:t>0.00</w:t>
+            </w:r>
+          </w:p>
+        </w:tc>
+        <w:tc>
+          <w:tcPr>
+            <w:tcW w:type="dxa" w:w="6480"/>
+            <w:vAlign w:val="center"/>
+            <w:tcMar>
+              <w:top w:w="80" w:type="dxa"/>
+              <w:start w:w="120" w:type="dxa"/>
+              <w:bottom w:w="80" w:type="dxa"/>
+              <w:end w:w="120" w:type="dxa"/>
+            </w:tcMar>
+          </w:tcPr>
+          <w:p>
+            <w:pPr>
+              <w:spacing w:after="0" w:line="252" w:lineRule="auto"/>
+            </w:pPr>
+            <w:r>
+              <w:rPr>
+                <w:rFonts w:ascii="Calibri" w:hAnsi="Calibri"/>
+                <w:sz w:val="17"/>
+              </w:rPr>
+              <w:t>Ignored by tuned fusion.</w:t>
+            </w:r>
+          </w:p>
+        </w:tc>
+      </w:tr>
+      <w:tr>
+        <w:tc>
+          <w:tcPr>
+            <w:tcW w:type="dxa" w:w="3024"/>
+            <w:vAlign w:val="center"/>
+            <w:tcMar>
+              <w:top w:w="80" w:type="dxa"/>
+              <w:start w:w="120" w:type="dxa"/>
+              <w:bottom w:w="80" w:type="dxa"/>
+              <w:end w:w="120" w:type="dxa"/>
+            </w:tcMar>
+          </w:tcPr>
+          <w:p>
+            <w:pPr>
+              <w:spacing w:after="0" w:line="252" w:lineRule="auto"/>
+            </w:pPr>
+            <w:r>
+              <w:rPr>
+                <w:rFonts w:ascii="Calibri" w:hAnsi="Calibri"/>
+                <w:sz w:val="17"/>
+              </w:rPr>
+              <w:t>gpp_doc_hyperlink</w:t>
+            </w:r>
+          </w:p>
+        </w:tc>
+        <w:tc>
+          <w:tcPr>
+            <w:tcW w:type="dxa" w:w="1584"/>
+            <w:vAlign w:val="center"/>
+            <w:tcMar>
+              <w:top w:w="80" w:type="dxa"/>
+              <w:start w:w="120" w:type="dxa"/>
+              <w:bottom w:w="80" w:type="dxa"/>
+              <w:end w:w="120" w:type="dxa"/>
+            </w:tcMar>
+          </w:tcPr>
+          <w:p>
+            <w:pPr>
+              <w:spacing w:after="0" w:line="252" w:lineRule="auto"/>
+            </w:pPr>
+            <w:r>
+              <w:rPr>
+                <w:rFonts w:ascii="Calibri" w:hAnsi="Calibri"/>
+                <w:sz w:val="17"/>
+              </w:rPr>
+              <w:t>0.25</w:t>
+            </w:r>
+          </w:p>
+        </w:tc>
+        <w:tc>
+          <w:tcPr>
+            <w:tcW w:type="dxa" w:w="6480"/>
+            <w:vAlign w:val="center"/>
+            <w:tcMar>
+              <w:top w:w="80" w:type="dxa"/>
+              <w:start w:w="120" w:type="dxa"/>
+              <w:bottom w:w="80" w:type="dxa"/>
+              <w:end w:w="120" w:type="dxa"/>
+            </w:tcMar>
+          </w:tcPr>
+          <w:p>
+            <w:pPr>
+              <w:spacing w:after="0" w:line="252" w:lineRule="auto"/>
+            </w:pPr>
+            <w:r>
+              <w:rPr>
+                <w:rFonts w:ascii="Calibri" w:hAnsi="Calibri"/>
+                <w:sz w:val="17"/>
+              </w:rPr>
+              <w:t>Small complementary hyperlink-doc signal.</w:t>
+            </w:r>
+          </w:p>
+        </w:tc>
+      </w:tr>
+      <w:tr>
+        <w:tc>
+          <w:tcPr>
+            <w:tcW w:type="dxa" w:w="3024"/>
+            <w:vAlign w:val="center"/>
+            <w:tcMar>
+              <w:top w:w="80" w:type="dxa"/>
+              <w:start w:w="120" w:type="dxa"/>
+              <w:bottom w:w="80" w:type="dxa"/>
+              <w:end w:w="120" w:type="dxa"/>
+            </w:tcMar>
+          </w:tcPr>
+          <w:p>
+            <w:pPr>
+              <w:spacing w:after="0" w:line="252" w:lineRule="auto"/>
+            </w:pPr>
+            <w:r>
+              <w:rPr>
+                <w:rFonts w:ascii="Calibri" w:hAnsi="Calibri"/>
+                <w:sz w:val="17"/>
+              </w:rPr>
+              <w:t>gpp_page_hyperlink</w:t>
+            </w:r>
+          </w:p>
+        </w:tc>
+        <w:tc>
+          <w:tcPr>
+            <w:tcW w:type="dxa" w:w="1584"/>
+            <w:vAlign w:val="center"/>
+            <w:tcMar>
+              <w:top w:w="80" w:type="dxa"/>
+              <w:start w:w="120" w:type="dxa"/>
+              <w:bottom w:w="80" w:type="dxa"/>
+              <w:end w:w="120" w:type="dxa"/>
+            </w:tcMar>
+          </w:tcPr>
+          <w:p>
+            <w:pPr>
+              <w:spacing w:after="0" w:line="252" w:lineRule="auto"/>
+            </w:pPr>
+            <w:r>
+              <w:rPr>
+                <w:rFonts w:ascii="Calibri" w:hAnsi="Calibri"/>
+                <w:sz w:val="17"/>
+              </w:rPr>
+              <w:t>4.00</w:t>
+            </w:r>
+          </w:p>
+        </w:tc>
+        <w:tc>
+          <w:tcPr>
+            <w:tcW w:type="dxa" w:w="6480"/>
+            <w:vAlign w:val="center"/>
+            <w:tcMar>
+              <w:top w:w="80" w:type="dxa"/>
+              <w:start w:w="120" w:type="dxa"/>
+              <w:bottom w:w="80" w:type="dxa"/>
+              <w:end w:w="120" w:type="dxa"/>
+            </w:tcMar>
+          </w:tcPr>
+          <w:p>
+            <w:pPr>
+              <w:spacing w:after="0" w:line="252" w:lineRule="auto"/>
+            </w:pPr>
+            <w:r>
+              <w:rPr>
+                <w:rFonts w:ascii="Calibri" w:hAnsi="Calibri"/>
+                <w:sz w:val="17"/>
+              </w:rPr>
+              <w:t>Strongest graph/hyperlink contribution.</w:t>
+            </w:r>
+          </w:p>
+        </w:tc>
+      </w:tr>
+    </w:tbl>
+    <w:p/>
+    <w:p>
+      <w:pPr>
+        <w:spacing w:after="120"/>
+      </w:pPr>
+      <w:r>
+        <w:rPr>
+          <w:rFonts w:ascii="Calibri" w:hAnsi="Calibri"/>
+          <w:sz w:val="21"/>
+        </w:rPr>
+        <w:t>Conclusion update: the fixed best GPP hyperlink config remains pagenode_to_hyperlink_pages + log_count + target_pages_per_doc=1 + MMR, but the best overall document-level direction is now tuned doc fusion using dense, SPLADE, and page-hyperlink GPP sources. Because M3DocVQA train has gold docs but no gold pages, this supports train-set document-level tuning, not supervised page-level tuning.</w:t>
       </w:r>
     </w:p>
     <w:sectPr>

</xml_diff>